<commit_message>
Add Method 2: Markup → share sheet Shortcut direct to DTTG group
Documents the "File to DTTG" Shortcut that uses DTTG's native Shortcuts
action (Create Item in DEVONthink To Go) to file directly into a named
group from the iOS share sheet — bypassing the Files app entirely.
Also integrates group selection into the multi-page screenshot Shortcut
(Method 3) and updates the summary table.

Co-Authored-By: Claude Sonnet 4.6 <noreply@anthropic.com>
Claude-Session: https://claude.ai/code/session_01A5C6Wp6Rndr1uzQjDdybfd
</commit_message>
<xml_diff>
--- a/iPad_to_DEVONthink_Guide.docx
+++ b/iPad_to_DEVONthink_Guide.docx
@@ -13,7 +13,7 @@
     <w:p/>
     <w:p>
       <w:r>
-        <w:t>Two complementary methods depending on what you are looking at on the iPad.</w:t>
+        <w:t>Four methods depending on what you are capturing and where you are in the workflow.</w:t>
       </w:r>
     </w:p>
     <w:p/>
@@ -132,13 +132,52 @@
         <w:pStyle w:val="Heading2"/>
       </w:pPr>
       <w:r>
-        <w:t>Method 2 – iOS Shortcut for any app (PDFs, emails, documents, maps…)</w:t>
+        <w:t>Method 2 – Markup screenshot direct to a DTTG group (recommended for New Scientist etc.)</w:t>
       </w:r>
     </w:p>
     <w:p/>
     <w:p>
       <w:r>
-        <w:t xml:space="preserve">Create the following Shortcut in the </w:t>
+        <w:t>This method replaces the cumbersome route of Markup → Save to Files → navigate to Files → share to DTTG. Instead, you share directly from inside Markup and the file lands in the correct DTTG group in one step.</w:t>
+      </w:r>
+    </w:p>
+    <w:p/>
+    <w:p>
+      <w:pPr>
+        <w:pStyle w:val="Heading3"/>
+      </w:pPr>
+      <w:r>
+        <w:t>How it works</w:t>
+      </w:r>
+    </w:p>
+    <w:p/>
+    <w:p>
+      <w:r>
+        <w:t xml:space="preserve">DEVONthink To Go provides its own </w:t>
+      </w:r>
+      <w:r>
+        <w:rPr>
+          <w:b/>
+        </w:rPr>
+        <w:t>Shortcuts actions</w:t>
+      </w:r>
+      <w:r>
+        <w:t>, including "Create Item in DEVONthink To Go", which can receive a file and place it into a named database and group — no DTTG interface interaction required. A Shortcut placed in the iOS Share Sheet becomes available as a one-tap action from anywhere: Markup, Files, Photos, Safari, or any other app.</w:t>
+      </w:r>
+    </w:p>
+    <w:p/>
+    <w:p>
+      <w:pPr>
+        <w:pStyle w:val="Heading3"/>
+      </w:pPr>
+      <w:r>
+        <w:t>One-time setup: create the Shortcut</w:t>
+      </w:r>
+    </w:p>
+    <w:p/>
+    <w:p>
+      <w:r>
+        <w:t xml:space="preserve">Open the </w:t>
       </w:r>
       <w:r>
         <w:rPr>
@@ -147,7 +186,579 @@
         <w:t>Shortcuts</w:t>
       </w:r>
       <w:r>
-        <w:t xml:space="preserve"> app on your iPad.</w:t>
+        <w:t xml:space="preserve"> app on your iPad and create a new Shortcut named </w:t>
+      </w:r>
+      <w:r>
+        <w:rPr>
+          <w:b/>
+        </w:rPr>
+        <w:t>"File to DTTG"</w:t>
+      </w:r>
+      <w:r>
+        <w:t>.</w:t>
+      </w:r>
+    </w:p>
+    <w:p/>
+    <w:tbl>
+      <w:tblPr>
+        <w:tblStyle w:val="TableGrid"/>
+        <w:tblW w:type="auto" w:w="0"/>
+        <w:tblLook w:firstColumn="1" w:firstRow="1" w:lastColumn="0" w:lastRow="0" w:noHBand="0" w:noVBand="1" w:val="04A0"/>
+      </w:tblPr>
+      <w:tblGrid>
+        <w:gridCol w:w="2880"/>
+        <w:gridCol w:w="2880"/>
+        <w:gridCol w:w="2880"/>
+      </w:tblGrid>
+      <w:tr>
+        <w:tc>
+          <w:tcPr>
+            <w:tcW w:type="dxa" w:w="2880"/>
+          </w:tcPr>
+          <w:p>
+            <w:r>
+              <w:rPr>
+                <w:b/>
+              </w:rPr>
+              <w:t>Step</w:t>
+            </w:r>
+          </w:p>
+        </w:tc>
+        <w:tc>
+          <w:tcPr>
+            <w:tcW w:type="dxa" w:w="2880"/>
+          </w:tcPr>
+          <w:p>
+            <w:r>
+              <w:rPr>
+                <w:b/>
+              </w:rPr>
+              <w:t>Action</w:t>
+            </w:r>
+          </w:p>
+        </w:tc>
+        <w:tc>
+          <w:tcPr>
+            <w:tcW w:type="dxa" w:w="2880"/>
+          </w:tcPr>
+          <w:p>
+            <w:r>
+              <w:rPr>
+                <w:b/>
+              </w:rPr>
+              <w:t>Setting</w:t>
+            </w:r>
+          </w:p>
+        </w:tc>
+      </w:tr>
+      <w:tr>
+        <w:tc>
+          <w:tcPr>
+            <w:tcW w:type="dxa" w:w="2880"/>
+          </w:tcPr>
+          <w:p>
+            <w:r>
+              <w:t>------</w:t>
+            </w:r>
+          </w:p>
+        </w:tc>
+        <w:tc>
+          <w:tcPr>
+            <w:tcW w:type="dxa" w:w="2880"/>
+          </w:tcPr>
+          <w:p>
+            <w:r>
+              <w:t>--------</w:t>
+            </w:r>
+          </w:p>
+        </w:tc>
+        <w:tc>
+          <w:tcPr>
+            <w:tcW w:type="dxa" w:w="2880"/>
+          </w:tcPr>
+          <w:p>
+            <w:r>
+              <w:t>---------</w:t>
+            </w:r>
+          </w:p>
+        </w:tc>
+      </w:tr>
+      <w:tr>
+        <w:tc>
+          <w:tcPr>
+            <w:tcW w:type="dxa" w:w="2880"/>
+          </w:tcPr>
+          <w:p>
+            <w:r>
+              <w:t>1</w:t>
+            </w:r>
+          </w:p>
+        </w:tc>
+        <w:tc>
+          <w:tcPr>
+            <w:tcW w:type="dxa" w:w="2880"/>
+          </w:tcPr>
+          <w:p>
+            <w:r>
+              <w:t>**Receive** input</w:t>
+            </w:r>
+          </w:p>
+        </w:tc>
+        <w:tc>
+          <w:tcPr>
+            <w:tcW w:type="dxa" w:w="2880"/>
+          </w:tcPr>
+          <w:p>
+            <w:r>
+              <w:t>Type: Any · From: Share Sheet and Shortcuts</w:t>
+            </w:r>
+          </w:p>
+        </w:tc>
+      </w:tr>
+      <w:tr>
+        <w:tc>
+          <w:tcPr>
+            <w:tcW w:type="dxa" w:w="2880"/>
+          </w:tcPr>
+          <w:p>
+            <w:r>
+              <w:t>2</w:t>
+            </w:r>
+          </w:p>
+        </w:tc>
+        <w:tc>
+          <w:tcPr>
+            <w:tcW w:type="dxa" w:w="2880"/>
+          </w:tcPr>
+          <w:p>
+            <w:r>
+              <w:t>**Choose from Menu**</w:t>
+            </w:r>
+          </w:p>
+        </w:tc>
+        <w:tc>
+          <w:tcPr>
+            <w:tcW w:type="dxa" w:w="2880"/>
+          </w:tcPr>
+          <w:p>
+            <w:r>
+              <w:t>Prompt: "File to which group?"</w:t>
+            </w:r>
+          </w:p>
+        </w:tc>
+      </w:tr>
+      <w:tr>
+        <w:tc>
+          <w:tcPr>
+            <w:tcW w:type="dxa" w:w="2880"/>
+          </w:tcPr>
+          <w:p>
+            <w:r>
+              <w:t>3</w:t>
+            </w:r>
+          </w:p>
+        </w:tc>
+        <w:tc>
+          <w:tcPr>
+            <w:tcW w:type="dxa" w:w="2880"/>
+          </w:tcPr>
+          <w:p>
+            <w:r>
+              <w:t>↳ Menu item: **"New Scientist"**</w:t>
+            </w:r>
+          </w:p>
+        </w:tc>
+        <w:tc>
+          <w:tcPr>
+            <w:tcW w:type="dxa" w:w="2880"/>
+          </w:tcPr>
+          <w:p>
+            <w:r>
+              <w:t>—</w:t>
+            </w:r>
+          </w:p>
+        </w:tc>
+      </w:tr>
+      <w:tr>
+        <w:tc>
+          <w:tcPr>
+            <w:tcW w:type="dxa" w:w="2880"/>
+          </w:tcPr>
+          <w:p>
+            <w:r>
+              <w:t>4</w:t>
+            </w:r>
+          </w:p>
+        </w:tc>
+        <w:tc>
+          <w:tcPr>
+            <w:tcW w:type="dxa" w:w="2880"/>
+          </w:tcPr>
+          <w:p>
+            <w:r>
+              <w:t>↳↳ **Create Item in DEVONthink To Go**</w:t>
+            </w:r>
+          </w:p>
+        </w:tc>
+        <w:tc>
+          <w:tcPr>
+            <w:tcW w:type="dxa" w:w="2880"/>
+          </w:tcPr>
+          <w:p>
+            <w:r>
+              <w:t>Item: Shortcut Input · Database: (your database) · Group: New Scientist</w:t>
+            </w:r>
+          </w:p>
+        </w:tc>
+      </w:tr>
+      <w:tr>
+        <w:tc>
+          <w:tcPr>
+            <w:tcW w:type="dxa" w:w="2880"/>
+          </w:tcPr>
+          <w:p>
+            <w:r>
+              <w:t>5</w:t>
+            </w:r>
+          </w:p>
+        </w:tc>
+        <w:tc>
+          <w:tcPr>
+            <w:tcW w:type="dxa" w:w="2880"/>
+          </w:tcPr>
+          <w:p>
+            <w:r>
+              <w:t>↳ Menu item: **"Fire Defence"**</w:t>
+            </w:r>
+          </w:p>
+        </w:tc>
+        <w:tc>
+          <w:tcPr>
+            <w:tcW w:type="dxa" w:w="2880"/>
+          </w:tcPr>
+          <w:p>
+            <w:r>
+              <w:t>—</w:t>
+            </w:r>
+          </w:p>
+        </w:tc>
+      </w:tr>
+      <w:tr>
+        <w:tc>
+          <w:tcPr>
+            <w:tcW w:type="dxa" w:w="2880"/>
+          </w:tcPr>
+          <w:p>
+            <w:r>
+              <w:t>6</w:t>
+            </w:r>
+          </w:p>
+        </w:tc>
+        <w:tc>
+          <w:tcPr>
+            <w:tcW w:type="dxa" w:w="2880"/>
+          </w:tcPr>
+          <w:p>
+            <w:r>
+              <w:t>↳↳ **Create Item in DEVONthink To Go**</w:t>
+            </w:r>
+          </w:p>
+        </w:tc>
+        <w:tc>
+          <w:tcPr>
+            <w:tcW w:type="dxa" w:w="2880"/>
+          </w:tcPr>
+          <w:p>
+            <w:r>
+              <w:t>Item: Shortcut Input · Database: (your database) · Group: Fire Defence</w:t>
+            </w:r>
+          </w:p>
+        </w:tc>
+      </w:tr>
+      <w:tr>
+        <w:tc>
+          <w:tcPr>
+            <w:tcW w:type="dxa" w:w="2880"/>
+          </w:tcPr>
+          <w:p>
+            <w:r>
+              <w:t>7</w:t>
+            </w:r>
+          </w:p>
+        </w:tc>
+        <w:tc>
+          <w:tcPr>
+            <w:tcW w:type="dxa" w:w="2880"/>
+          </w:tcPr>
+          <w:p>
+            <w:r>
+              <w:t>↳ Menu item: **"Inbox"**</w:t>
+            </w:r>
+          </w:p>
+        </w:tc>
+        <w:tc>
+          <w:tcPr>
+            <w:tcW w:type="dxa" w:w="2880"/>
+          </w:tcPr>
+          <w:p>
+            <w:r>
+              <w:t>—</w:t>
+            </w:r>
+          </w:p>
+        </w:tc>
+      </w:tr>
+      <w:tr>
+        <w:tc>
+          <w:tcPr>
+            <w:tcW w:type="dxa" w:w="2880"/>
+          </w:tcPr>
+          <w:p>
+            <w:r>
+              <w:t>8</w:t>
+            </w:r>
+          </w:p>
+        </w:tc>
+        <w:tc>
+          <w:tcPr>
+            <w:tcW w:type="dxa" w:w="2880"/>
+          </w:tcPr>
+          <w:p>
+            <w:r>
+              <w:t>↳↳ **Create Item in DEVONthink To Go**</w:t>
+            </w:r>
+          </w:p>
+        </w:tc>
+        <w:tc>
+          <w:tcPr>
+            <w:tcW w:type="dxa" w:w="2880"/>
+          </w:tcPr>
+          <w:p>
+            <w:r>
+              <w:t>Item: Shortcut Input · Database: (your database) · Group: Inbox</w:t>
+            </w:r>
+          </w:p>
+        </w:tc>
+      </w:tr>
+    </w:tbl>
+    <w:p/>
+    <w:p/>
+    <w:p>
+      <w:r>
+        <w:t xml:space="preserve">Add or remove menu items to match your actual DTTG groups. The "Create Item in DEVONthink To Go" action is found by searching </w:t>
+      </w:r>
+      <w:r>
+        <w:rPr>
+          <w:b/>
+        </w:rPr>
+        <w:t>"DEVONthink"</w:t>
+      </w:r>
+      <w:r>
+        <w:t xml:space="preserve"> in the Shortcuts action library — it only appears after DTTG is installed.</w:t>
+      </w:r>
+    </w:p>
+    <w:p/>
+    <w:p>
+      <w:pPr>
+        <w:pStyle w:val="Heading3"/>
+      </w:pPr>
+      <w:r>
+        <w:t>Using it from Markup</w:t>
+      </w:r>
+    </w:p>
+    <w:p/>
+    <w:p>
+      <w:pPr>
+        <w:pStyle w:val="ListNumber"/>
+      </w:pPr>
+      <w:r>
+        <w:t>Take a screenshot (Side button + Volume Up) — or open an existing image in Markup.</w:t>
+      </w:r>
+    </w:p>
+    <w:p>
+      <w:pPr>
+        <w:pStyle w:val="ListNumber"/>
+      </w:pPr>
+      <w:r>
+        <w:t>Annotate as needed in Markup.</w:t>
+      </w:r>
+    </w:p>
+    <w:p>
+      <w:pPr>
+        <w:pStyle w:val="ListNumber"/>
+      </w:pPr>
+      <w:r>
+        <w:t xml:space="preserve">Tap the </w:t>
+      </w:r>
+      <w:r>
+        <w:rPr>
+          <w:b/>
+        </w:rPr>
+        <w:t>Share button</w:t>
+      </w:r>
+      <w:r>
+        <w:t xml:space="preserve"> (arrow-out-of-box, top right) — </w:t>
+      </w:r>
+      <w:r>
+        <w:rPr>
+          <w:b/>
+        </w:rPr>
+        <w:t>not</w:t>
+      </w:r>
+      <w:r>
+        <w:t xml:space="preserve"> Done → Save to Files.</w:t>
+      </w:r>
+    </w:p>
+    <w:p>
+      <w:pPr>
+        <w:pStyle w:val="ListNumber"/>
+      </w:pPr>
+      <w:r>
+        <w:t xml:space="preserve">In the share sheet, tap </w:t>
+      </w:r>
+      <w:r>
+        <w:rPr>
+          <w:b/>
+        </w:rPr>
+        <w:t>"File to DTTG"</w:t>
+      </w:r>
+      <w:r>
+        <w:t xml:space="preserve"> (your Shortcut).</w:t>
+      </w:r>
+    </w:p>
+    <w:p>
+      <w:pPr>
+        <w:pStyle w:val="ListNumber"/>
+      </w:pPr>
+      <w:r>
+        <w:t>Tap the group name you want.</w:t>
+      </w:r>
+    </w:p>
+    <w:p>
+      <w:pPr>
+        <w:pStyle w:val="ListNumber"/>
+      </w:pPr>
+      <w:r>
+        <w:t>The file appears in that DTTG group immediately. Syncs to DEVONthink on your Mac via the Contabo syncstore.</w:t>
+      </w:r>
+    </w:p>
+    <w:p/>
+    <w:p>
+      <w:pPr>
+        <w:pStyle w:val="Heading3"/>
+      </w:pPr>
+      <w:r>
+        <w:t>Using it from Files (for files already saved there)</w:t>
+      </w:r>
+    </w:p>
+    <w:p/>
+    <w:p>
+      <w:pPr>
+        <w:pStyle w:val="ListNumber"/>
+      </w:pPr>
+      <w:r>
+        <w:t xml:space="preserve">Open </w:t>
+      </w:r>
+      <w:r>
+        <w:rPr>
+          <w:b/>
+        </w:rPr>
+        <w:t>Files</w:t>
+      </w:r>
+      <w:r>
+        <w:t>, navigate to the saved file.</w:t>
+      </w:r>
+    </w:p>
+    <w:p>
+      <w:pPr>
+        <w:pStyle w:val="ListNumber"/>
+      </w:pPr>
+      <w:r>
+        <w:t xml:space="preserve">Long-press the file → </w:t>
+      </w:r>
+      <w:r>
+        <w:rPr>
+          <w:b/>
+        </w:rPr>
+        <w:t>Share</w:t>
+      </w:r>
+      <w:r>
+        <w:t>.</w:t>
+      </w:r>
+    </w:p>
+    <w:p>
+      <w:pPr>
+        <w:pStyle w:val="ListNumber"/>
+      </w:pPr>
+      <w:r>
+        <w:t xml:space="preserve">Tap </w:t>
+      </w:r>
+      <w:r>
+        <w:rPr>
+          <w:b/>
+        </w:rPr>
+        <w:t>"File to DTTG"</w:t>
+      </w:r>
+      <w:r>
+        <w:t xml:space="preserve"> in the share sheet.</w:t>
+      </w:r>
+    </w:p>
+    <w:p>
+      <w:pPr>
+        <w:pStyle w:val="ListNumber"/>
+      </w:pPr>
+      <w:r>
+        <w:t>Choose the group.</w:t>
+      </w:r>
+    </w:p>
+    <w:p/>
+    <w:p>
+      <w:pPr>
+        <w:pStyle w:val="Heading3"/>
+      </w:pPr>
+      <w:r>
+        <w:t>Notes</w:t>
+      </w:r>
+    </w:p>
+    <w:p/>
+    <w:p>
+      <w:pPr>
+        <w:pStyle w:val="ListBullet"/>
+      </w:pPr>
+      <w:r>
+        <w:t>The Shortcut works for any file type: PNG, JPG, PDF, even text files.</w:t>
+      </w:r>
+    </w:p>
+    <w:p>
+      <w:pPr>
+        <w:pStyle w:val="ListBullet"/>
+      </w:pPr>
+      <w:r>
+        <w:t>If "Create Item in DEVONthink To Go" does not appear in the Shortcuts action library, check that DTTG is installed and open Settings → DEVONthink To Go → allow Siri &amp; Shortcuts.</w:t>
+      </w:r>
+    </w:p>
+    <w:p>
+      <w:pPr>
+        <w:pStyle w:val="ListBullet"/>
+      </w:pPr>
+      <w:r>
+        <w:t>The file goes straight into the group — DTTG does not need to be open or in the foreground.</w:t>
+      </w:r>
+    </w:p>
+    <w:p/>
+    <w:p/>
+    <w:p/>
+    <w:p>
+      <w:pPr>
+        <w:pStyle w:val="Heading2"/>
+      </w:pPr>
+      <w:r>
+        <w:t>Method 3 – iOS Shortcut for multi-page scrolling documents</w:t>
+      </w:r>
+    </w:p>
+    <w:p/>
+    <w:p>
+      <w:r>
+        <w:t>Use this when the document is longer than one screen in an app that does not support Full Page export (not Safari).</w:t>
       </w:r>
     </w:p>
     <w:p/>
@@ -549,7 +1160,7 @@
           </w:tcPr>
           <w:p>
             <w:r>
-              <w:t>**Share** PDF</w:t>
+              <w:t>**Choose from Menu**</w:t>
             </w:r>
           </w:p>
         </w:tc>
@@ -559,7 +1170,39 @@
           </w:tcPr>
           <w:p>
             <w:r>
-              <w:t>Share with: **DEVONthink To Go**</w:t>
+              <w:t>Prompt: "File to which group?" (same group menu as Method 2)</w:t>
+            </w:r>
+          </w:p>
+        </w:tc>
+      </w:tr>
+      <w:tr>
+        <w:tc>
+          <w:tcPr>
+            <w:tcW w:type="dxa" w:w="2880"/>
+          </w:tcPr>
+          <w:p>
+            <w:r>
+              <w:t>11</w:t>
+            </w:r>
+          </w:p>
+        </w:tc>
+        <w:tc>
+          <w:tcPr>
+            <w:tcW w:type="dxa" w:w="2880"/>
+          </w:tcPr>
+          <w:p>
+            <w:r>
+              <w:t>↳ **Create Item in DEVONthink To Go**</w:t>
+            </w:r>
+          </w:p>
+        </w:tc>
+        <w:tc>
+          <w:tcPr>
+            <w:tcW w:type="dxa" w:w="2880"/>
+          </w:tcPr>
+          <w:p>
+            <w:r>
+              <w:t>Item: PDF from step 9 · Group: chosen group</w:t>
             </w:r>
           </w:p>
         </w:tc>
@@ -581,7 +1224,7 @@
         <w:pStyle w:val="ListNumber"/>
       </w:pPr>
       <w:r>
-        <w:t>Navigate to the first page of the document on your iPad.</w:t>
+        <w:t>Navigate to the first screen of the document.</w:t>
       </w:r>
     </w:p>
     <w:p>
@@ -589,7 +1232,7 @@
         <w:pStyle w:val="ListNumber"/>
       </w:pPr>
       <w:r>
-        <w:t>Run the Shortcut (add it to your Home Screen or the Share Sheet for one tap).</w:t>
+        <w:t>Run the Shortcut from your Home Screen or the Shortcuts widget.</w:t>
       </w:r>
     </w:p>
     <w:p>
@@ -597,7 +1240,7 @@
         <w:pStyle w:val="ListNumber"/>
       </w:pPr>
       <w:r>
-        <w:t>Enter a title when prompted.</w:t>
+        <w:t>Enter a title.</w:t>
       </w:r>
     </w:p>
     <w:p>
@@ -605,7 +1248,7 @@
         <w:pStyle w:val="ListNumber"/>
       </w:pPr>
       <w:r>
-        <w:t xml:space="preserve">Take screenshot, scroll down, tap </w:t>
+        <w:t xml:space="preserve">Take screenshot, scroll, tap </w:t>
       </w:r>
       <w:r>
         <w:rPr>
@@ -614,7 +1257,7 @@
         <w:t>"Yes"</w:t>
       </w:r>
       <w:r>
-        <w:t>, repeat for each page.</w:t>
+        <w:t>, repeat for each screen.</w:t>
       </w:r>
     </w:p>
     <w:p>
@@ -622,7 +1265,7 @@
         <w:pStyle w:val="ListNumber"/>
       </w:pPr>
       <w:r>
-        <w:t xml:space="preserve">When on the last page, tap </w:t>
+        <w:t xml:space="preserve">On the last screen tap </w:t>
       </w:r>
       <w:r>
         <w:rPr>
@@ -639,7 +1282,7 @@
         <w:pStyle w:val="ListNumber"/>
       </w:pPr>
       <w:r>
-        <w:t>DEVONthink To Go opens automatically with the finished PDF ready to file.</w:t>
+        <w:t>Choose the DTTG group — the stitched PDF is filed immediately.</w:t>
       </w:r>
     </w:p>
     <w:p/>
@@ -650,13 +1293,13 @@
         <w:pStyle w:val="Heading2"/>
       </w:pPr>
       <w:r>
-        <w:t>Method 3 – Automatic Mac-side stitching (best image quality)</w:t>
+        <w:t>Method 4 – Automatic Mac-side stitching (best image quality, optional)</w:t>
       </w:r>
     </w:p>
     <w:p/>
     <w:p>
       <w:r>
-        <w:t>Use this when you want overlap-trimming and higher-quality output.</w:t>
+        <w:t>Use this only when you need the overlap-trimming that the iOS Shortcut cannot provide — for example, very long documents where duplicate scroll regions are visible in the stitched result.</w:t>
       </w:r>
     </w:p>
     <w:p/>
@@ -677,14 +1320,7 @@
           <w:color w:val="202020"/>
           <w:sz w:val="18"/>
         </w:rPr>
-        <w:t># Install dependencies</w:t>
-        <w:br/>
         <w:t>pip3 install Pillow numpy watchdog</w:t>
-        <w:br/>
-        <w:br/>
-        <w:t># Clone / open the project folder</w:t>
-        <w:br/>
-        <w:t>cd ~/path/to/ARMAC-fire-defence</w:t>
       </w:r>
     </w:p>
     <w:p/>
@@ -693,105 +1329,7 @@
         <w:pStyle w:val="Heading3"/>
       </w:pPr>
       <w:r>
-        <w:t>Configure iCloud sync</w:t>
-      </w:r>
-    </w:p>
-    <w:p/>
-    <w:p>
-      <w:r>
-        <w:t xml:space="preserve">On your iPad, enable </w:t>
-      </w:r>
-      <w:r>
-        <w:rPr>
-          <w:b/>
-        </w:rPr>
-        <w:t>iCloud Drive</w:t>
-      </w:r>
-      <w:r>
-        <w:t xml:space="preserve"> for the </w:t>
-      </w:r>
-      <w:r>
-        <w:rPr>
-          <w:b/>
-        </w:rPr>
-        <w:t>Screenshots</w:t>
-      </w:r>
-      <w:r>
-        <w:t xml:space="preserve"> album  </w:t>
-      </w:r>
-    </w:p>
-    <w:p>
-      <w:r>
-        <w:t xml:space="preserve">(Settings → [Your Name] → iCloud → Photos → turn on iCloud Photos).  </w:t>
-      </w:r>
-    </w:p>
-    <w:p>
-      <w:r>
-        <w:t>On your Mac, the screenshots appear at:</w:t>
-      </w:r>
-    </w:p>
-    <w:p>
-      <w:pPr/>
-      <w:r>
-        <w:rPr>
-          <w:rFonts w:ascii="Courier New" w:hAnsi="Courier New"/>
-          <w:color w:val="202020"/>
-          <w:sz w:val="18"/>
-        </w:rPr>
-        <w:t>~/Library/Mobile Documents/com~apple~CloudDocs/</w:t>
-      </w:r>
-    </w:p>
-    <w:p/>
-    <w:p>
-      <w:r>
-        <w:t xml:space="preserve">Or use the dedicated </w:t>
-      </w:r>
-      <w:r>
-        <w:rPr>
-          <w:b/>
-        </w:rPr>
-        <w:t>Files</w:t>
-      </w:r>
-      <w:r>
-        <w:t xml:space="preserve"> app folder approach:</w:t>
-      </w:r>
-    </w:p>
-    <w:p>
-      <w:pPr>
-        <w:pStyle w:val="ListBullet"/>
-      </w:pPr>
-      <w:r>
-        <w:t xml:space="preserve">On iPad: save screenshots to </w:t>
-      </w:r>
-      <w:r>
-        <w:rPr>
-          <w:b/>
-        </w:rPr>
-        <w:t>Files → iCloud Drive → Screenshots</w:t>
-      </w:r>
-    </w:p>
-    <w:p>
-      <w:pPr>
-        <w:pStyle w:val="ListBullet"/>
-      </w:pPr>
-      <w:r>
-        <w:t xml:space="preserve">Mac path: </w:t>
-      </w:r>
-      <w:r>
-        <w:rPr>
-          <w:rFonts w:ascii="Courier New" w:hAnsi="Courier New"/>
-          <w:sz w:val="20"/>
-        </w:rPr>
-        <w:t>~/Library/Mobile Documents/com~apple~CloudDocs/Screenshots</w:t>
-      </w:r>
-    </w:p>
-    <w:p/>
-    <w:p>
-      <w:pPr>
-        <w:pStyle w:val="Heading3"/>
-      </w:pPr>
-      <w:r>
-        <w:t>Watch mode (leave running on your Mac)</w:t>
+        <w:t>Watch mode</w:t>
       </w:r>
     </w:p>
     <w:p/>
@@ -813,44 +1351,7 @@
     <w:p/>
     <w:p>
       <w:r>
-        <w:t>Every time you drop screenshots into the watched folder from your iPad</w:t>
-      </w:r>
-    </w:p>
-    <w:p>
-      <w:r>
-        <w:t>(they sync automatically via iCloud), the script:</w:t>
-      </w:r>
-    </w:p>
-    <w:p>
-      <w:pPr>
-        <w:pStyle w:val="ListNumber"/>
-      </w:pPr>
-      <w:r>
-        <w:t>Waits 3 seconds for the batch to finish syncing.</w:t>
-      </w:r>
-    </w:p>
-    <w:p>
-      <w:pPr>
-        <w:pStyle w:val="ListNumber"/>
-      </w:pPr>
-      <w:r>
-        <w:t>Stitches them vertically, trimming duplicate scroll regions.</w:t>
-      </w:r>
-    </w:p>
-    <w:p>
-      <w:pPr>
-        <w:pStyle w:val="ListNumber"/>
-      </w:pPr>
-      <w:r>
-        <w:t>Saves a PDF next to the originals.</w:t>
-      </w:r>
-    </w:p>
-    <w:p>
-      <w:pPr>
-        <w:pStyle w:val="ListNumber"/>
-      </w:pPr>
-      <w:r>
-        <w:t>Imports it into the specified DEVONthink group.</w:t>
+        <w:t>Screenshots synced via iCloud are automatically stitched, trimmed, and imported into DEVONthink on the Mac. DEVONthink then syncs the result back to DTTG via the Contabo syncstore.</w:t>
       </w:r>
     </w:p>
     <w:p/>
@@ -871,13 +1372,9 @@
           <w:color w:val="202020"/>
           <w:sz w:val="18"/>
         </w:rPr>
-        <w:t>python3 stitch_to_devonthink.py \</w:t>
+        <w:t>python3 stitch_to_devonthink.py page1.png page2.png page3.png \</w:t>
         <w:br/>
-        <w:t xml:space="preserve">    ~/Desktop/page1.png ~/Desktop/page2.png ~/Desktop/page3.png \</w:t>
-        <w:br/>
-        <w:t xml:space="preserve">    --import \</w:t>
-        <w:br/>
-        <w:t xml:space="preserve">    --group "Fire Defence"</w:t>
+        <w:t xml:space="preserve">    --import --group "Fire Defence"</w:t>
       </w:r>
     </w:p>
     <w:p/>
@@ -925,7 +1422,7 @@
               <w:rPr>
                 <w:b/>
               </w:rPr>
-              <w:t>Best method</w:t>
+              <w:t>Method</w:t>
             </w:r>
           </w:p>
         </w:tc>
@@ -947,7 +1444,7 @@
           </w:tcPr>
           <w:p>
             <w:r>
-              <w:t>-------------</w:t>
+              <w:t>--------</w:t>
             </w:r>
           </w:p>
         </w:tc>
@@ -969,7 +1466,7 @@
           </w:tcPr>
           <w:p>
             <w:r>
-              <w:t>Method 1 (Full Page screenshot)</w:t>
+              <w:t>1 – Full Page screenshot</w:t>
             </w:r>
           </w:p>
         </w:tc>
@@ -981,7 +1478,7 @@
           </w:tcPr>
           <w:p>
             <w:r>
-              <w:t>PDF viewer, email, map, or any other app</w:t>
+              <w:t>Markup screenshot or any single-page file</w:t>
             </w:r>
           </w:p>
         </w:tc>
@@ -991,7 +1488,7 @@
           </w:tcPr>
           <w:p>
             <w:r>
-              <w:t>Method 2 (Shortcut)</w:t>
+              <w:t>2 – "File to DTTG" Shortcut via Share button</w:t>
             </w:r>
           </w:p>
         </w:tc>
@@ -1003,7 +1500,7 @@
           </w:tcPr>
           <w:p>
             <w:r>
-              <w:t>Need best quality / automatic trimming of overlap</w:t>
+              <w:t>File already saved in the Files app</w:t>
             </w:r>
           </w:p>
         </w:tc>
@@ -1013,7 +1510,7 @@
           </w:tcPr>
           <w:p>
             <w:r>
-              <w:t>Method 3 (Mac script)</w:t>
+              <w:t>2 – same Shortcut, from Files share sheet</w:t>
             </w:r>
           </w:p>
         </w:tc>
@@ -1025,7 +1522,7 @@
           </w:tcPr>
           <w:p>
             <w:r>
-              <w:t>No Mac available</w:t>
+              <w:t>Multi-page scrolling document, any app</w:t>
             </w:r>
           </w:p>
         </w:tc>
@@ -1035,7 +1532,29 @@
           </w:tcPr>
           <w:p>
             <w:r>
-              <w:t>Method 2 (Shortcut)</w:t>
+              <w:t>3 – screenshot loop Shortcut</w:t>
+            </w:r>
+          </w:p>
+        </w:tc>
+      </w:tr>
+      <w:tr>
+        <w:tc>
+          <w:tcPr>
+            <w:tcW w:type="dxa" w:w="4320"/>
+          </w:tcPr>
+          <w:p>
+            <w:r>
+              <w:t>Very long document, overlap trimming needed</w:t>
+            </w:r>
+          </w:p>
+        </w:tc>
+        <w:tc>
+          <w:tcPr>
+            <w:tcW w:type="dxa" w:w="4320"/>
+          </w:tcPr>
+          <w:p>
+            <w:r>
+              <w:t>4 – Mac script</w:t>
             </w:r>
           </w:p>
         </w:tc>

</xml_diff>